<commit_message>
Fix meeting paper Word truncation and empty fluff bullets
Stop ellipsizing campaign background and biography mid-sentence, remove
placeholder empty list paragraphs from the fillable templates, and render
objectives/key messages/cust sat as real paragraph loops with a post-render
strip for any leftover empty numbered items.

Co-authored-by: Rex <rexheng@users.noreply.github.com>
</commit_message>
<xml_diff>
--- a/public/templates/meeting-paper-airshow-fillable.docx
+++ b/public/templates/meeting-paper-airshow-fillable.docx
@@ -433,60 +433,8 @@
                 <w:szCs w:val="21"/>
                 <w:lang w:eastAsia="ja-JP"/>
               </w:rPr>
-              <w:t>{{customer_block}}</w:t>
+              <w:t>{{#customer_lines}}{{.}}{{/customer_lines}}</w:t>
             </w:r>
-            <w:r>
-              <w:rPr>
-                <w:rFonts w:ascii="Arial Narrow" w:hAnsi="Arial Narrow"/>
-                <w:color w:val="0000FF"/>
-                <w:sz w:val="21"/>
-                <w:szCs w:val="21"/>
-                <w:lang w:eastAsia="ja-JP"/>
-              </w:rPr>
-            </w:r>
-          </w:p>
-          <w:p>
-            <w:pPr>
-              <w:pStyle w:val="ListParagraph"/>
-              <w:numPr>
-                <w:ilvl w:val="1"/>
-                <w:numId w:val="6"/>
-              </w:numPr>
-              <w:rPr>
-                <w:rFonts w:ascii="Arial Narrow" w:hAnsi="Arial Narrow"/>
-                <w:b w:val="1"/>
-                <w:bCs w:val="1"/>
-                <w:color w:val="0000FF"/>
-                <w:sz w:val="21"/>
-                <w:szCs w:val="21"/>
-                <w:lang w:eastAsia="ja-JP"/>
-              </w:rPr>
-            </w:pPr>
-            <w:r>
-              <w:rPr>
-                <w:rFonts w:ascii="Arial Narrow" w:hAnsi="Arial Narrow"/>
-                <w:color w:val="0000FF"/>
-                <w:sz w:val="21"/>
-                <w:szCs w:val="21"/>
-                <w:lang w:eastAsia="ja-JP"/>
-              </w:rPr>
-            </w:r>
-          </w:p>
-          <w:p>
-            <w:pPr>
-              <w:pStyle w:val="ListParagraph"/>
-              <w:numPr>
-                <w:ilvl w:val="1"/>
-                <w:numId w:val="6"/>
-              </w:numPr>
-              <w:rPr>
-                <w:rFonts w:ascii="Arial Narrow" w:hAnsi="Arial Narrow"/>
-                <w:color w:val="0000FF"/>
-                <w:sz w:val="21"/>
-                <w:szCs w:val="21"/>
-                <w:lang w:eastAsia="ja-JP"/>
-              </w:rPr>
-            </w:pPr>
             <w:r>
               <w:rPr>
                 <w:rFonts w:ascii="Arial Narrow" w:hAnsi="Arial Narrow"/>
@@ -555,57 +503,7 @@
                 <w:szCs w:val="21"/>
                 <w:lang w:eastAsia="ja-JP"/>
               </w:rPr>
-              <w:t>{{objectives}}</w:t>
-            </w:r>
-          </w:p>
-          <w:p>
-            <w:pPr>
-              <w:pStyle w:val="ListParagraph"/>
-              <w:numPr>
-                <w:ilvl w:val="0"/>
-                <w:numId w:val="9"/>
-              </w:numPr>
-              <w:rPr>
-                <w:rFonts w:ascii="Arial Narrow" w:hAnsi="Arial Narrow"/>
-                <w:color w:val="0000FF"/>
-                <w:sz w:val="21"/>
-                <w:szCs w:val="21"/>
-                <w:lang w:eastAsia="ja-JP"/>
-              </w:rPr>
-            </w:pPr>
-            <w:r>
-              <w:rPr>
-                <w:rFonts w:ascii="Arial Narrow" w:hAnsi="Arial Narrow"/>
-                <w:color w:val="0000FF"/>
-                <w:sz w:val="21"/>
-                <w:szCs w:val="21"/>
-                <w:lang w:eastAsia="ja-JP"/>
-              </w:rPr>
-            </w:r>
-          </w:p>
-          <w:p>
-            <w:pPr>
-              <w:pStyle w:val="ListParagraph"/>
-              <w:numPr>
-                <w:ilvl w:val="0"/>
-                <w:numId w:val="9"/>
-              </w:numPr>
-              <w:rPr>
-                <w:rFonts w:ascii="Arial Narrow" w:hAnsi="Arial Narrow"/>
-                <w:color w:val="0000FF"/>
-                <w:sz w:val="21"/>
-                <w:szCs w:val="21"/>
-                <w:lang w:eastAsia="ja-JP"/>
-              </w:rPr>
-            </w:pPr>
-            <w:r>
-              <w:rPr>
-                <w:rFonts w:ascii="Arial Narrow" w:hAnsi="Arial Narrow"/>
-                <w:color w:val="0000FF"/>
-                <w:sz w:val="21"/>
-                <w:szCs w:val="21"/>
-                <w:lang w:eastAsia="ja-JP"/>
-              </w:rPr>
+              <w:t>{{#objectives}}{{.}}{{/objectives}}</w:t>
             </w:r>
           </w:p>
           <w:p>
@@ -679,153 +577,7 @@
                 <w:sz w:val="21"/>
                 <w:szCs w:val="21"/>
               </w:rPr>
-              <w:t>{{key_messages}}</w:t>
-            </w:r>
-          </w:p>
-          <w:p>
-            <w:pPr>
-              <w:pStyle w:val="ListParagraph"/>
-              <w:numPr>
-                <w:ilvl w:val="1"/>
-                <w:numId w:val="4"/>
-              </w:numPr>
-              <w:rPr>
-                <w:rFonts w:ascii="Arial Narrow" w:hAnsi="Arial Narrow"/>
-                <w:color w:val="0000FF"/>
-                <w:sz w:val="21"/>
-                <w:szCs w:val="21"/>
-              </w:rPr>
-            </w:pPr>
-            <w:r>
-              <w:rPr>
-                <w:rFonts w:ascii="Arial Narrow" w:hAnsi="Arial Narrow"/>
-                <w:i/>
-                <w:iCs/>
-                <w:color w:val="0000FF"/>
-                <w:sz w:val="21"/>
-                <w:szCs w:val="21"/>
-              </w:rPr>
-            </w:r>
-            <w:r>
-              <w:rPr>
-                <w:rFonts w:ascii="Arial Narrow" w:hAnsi="Arial Narrow"/>
-                <w:i/>
-                <w:iCs/>
-                <w:color w:val="0000FF"/>
-                <w:sz w:val="21"/>
-                <w:szCs w:val="21"/>
-              </w:rPr>
-            </w:r>
-            <w:r>
-              <w:rPr>
-                <w:rFonts w:ascii="Arial Narrow" w:hAnsi="Arial Narrow"/>
-                <w:i/>
-                <w:iCs/>
-                <w:color w:val="0000FF"/>
-                <w:sz w:val="21"/>
-                <w:szCs w:val="21"/>
-              </w:rPr>
-            </w:r>
-            <w:r>
-              <w:rPr>
-                <w:rFonts w:ascii="Arial Narrow" w:hAnsi="Arial Narrow"/>
-                <w:i/>
-                <w:iCs/>
-                <w:color w:val="0000FF"/>
-                <w:sz w:val="21"/>
-                <w:szCs w:val="21"/>
-              </w:rPr>
-            </w:r>
-          </w:p>
-          <w:p>
-            <w:pPr>
-              <w:pStyle w:val="ListParagraph"/>
-              <w:numPr>
-                <w:ilvl w:val="1"/>
-                <w:numId w:val="4"/>
-              </w:numPr>
-              <w:rPr>
-                <w:rFonts w:ascii="Arial Narrow" w:hAnsi="Arial Narrow"/>
-                <w:color w:val="0000FF"/>
-                <w:sz w:val="21"/>
-                <w:szCs w:val="21"/>
-              </w:rPr>
-            </w:pPr>
-            <w:r>
-              <w:rPr>
-                <w:rFonts w:ascii="Arial Narrow" w:hAnsi="Arial Narrow"/>
-                <w:i/>
-                <w:iCs/>
-                <w:color w:val="0000FF"/>
-                <w:sz w:val="21"/>
-                <w:szCs w:val="21"/>
-              </w:rPr>
-            </w:r>
-            <w:r>
-              <w:rPr>
-                <w:rFonts w:ascii="Arial Narrow" w:hAnsi="Arial Narrow"/>
-                <w:i/>
-                <w:iCs/>
-                <w:color w:val="0000FF"/>
-                <w:sz w:val="21"/>
-                <w:szCs w:val="21"/>
-              </w:rPr>
-            </w:r>
-            <w:r>
-              <w:rPr>
-                <w:rFonts w:ascii="Arial Narrow" w:hAnsi="Arial Narrow"/>
-                <w:i/>
-                <w:iCs/>
-                <w:color w:val="0000FF"/>
-                <w:sz w:val="21"/>
-                <w:szCs w:val="21"/>
-              </w:rPr>
-            </w:r>
-          </w:p>
-          <w:p>
-            <w:pPr>
-              <w:pStyle w:val="ListParagraph"/>
-              <w:numPr>
-                <w:ilvl w:val="0"/>
-                <w:numId w:val="4"/>
-              </w:numPr>
-              <w:rPr>
-                <w:rFonts w:ascii="Arial Narrow" w:hAnsi="Arial Narrow"/>
-                <w:color w:val="0000FF"/>
-                <w:sz w:val="21"/>
-                <w:szCs w:val="21"/>
-              </w:rPr>
-            </w:pPr>
-            <w:r>
-              <w:rPr>
-                <w:rFonts w:ascii="Arial Narrow" w:hAnsi="Arial Narrow"/>
-                <w:color w:val="0000FF"/>
-                <w:sz w:val="21"/>
-                <w:szCs w:val="21"/>
-              </w:rPr>
-            </w:r>
-          </w:p>
-          <w:p>
-            <w:pPr>
-              <w:pStyle w:val="ListParagraph"/>
-              <w:numPr>
-                <w:ilvl w:val="0"/>
-                <w:numId w:val="4"/>
-              </w:numPr>
-              <w:rPr>
-                <w:rFonts w:ascii="Arial Narrow" w:hAnsi="Arial Narrow"/>
-                <w:color w:val="0000FF"/>
-                <w:sz w:val="21"/>
-                <w:szCs w:val="21"/>
-              </w:rPr>
-            </w:pPr>
-            <w:r>
-              <w:rPr>
-                <w:rFonts w:ascii="Arial Narrow" w:hAnsi="Arial Narrow"/>
-                <w:color w:val="0000FF"/>
-                <w:sz w:val="21"/>
-                <w:szCs w:val="21"/>
-              </w:rPr>
+              <w:t>{{#key_messages}}{{.}}{{/key_messages}}</w:t>
             </w:r>
           </w:p>
           <w:p>
@@ -907,43 +659,6 @@
           </w:p>
           <w:p>
             <w:pPr>
-              <w:numPr>
-                <w:ilvl w:val="0"/>
-                <w:numId w:val="3"/>
-              </w:numPr>
-              <w:rPr>
-                <w:rFonts w:ascii="Arial Narrow" w:hAnsi="Arial Narrow"/>
-                <w:b/>
-                <w:color w:val="0000FF"/>
-                <w:sz w:val="21"/>
-                <w:szCs w:val="21"/>
-                <w:u w:val="single"/>
-                <w:lang w:eastAsia="ja-JP"/>
-              </w:rPr>
-            </w:pPr>
-            <w:r>
-              <w:rPr>
-                <w:rFonts w:ascii="Arial Narrow" w:hAnsi="Arial Narrow"/>
-                <w:color w:val="0000FF"/>
-                <w:sz w:val="21"/>
-                <w:szCs w:val="21"/>
-                <w:lang w:eastAsia="ja-JP"/>
-              </w:rPr>
-            </w:r>
-            <w:r>
-              <w:rPr>
-                <w:rFonts w:ascii="Arial Narrow" w:hAnsi="Arial Narrow"/>
-                <w:b/>
-                <w:color w:val="0000FF"/>
-                <w:sz w:val="21"/>
-                <w:szCs w:val="21"/>
-                <w:u w:val="single"/>
-                <w:lang w:eastAsia="ja-JP"/>
-              </w:rPr>
-            </w:r>
-          </w:p>
-          <w:p>
-            <w:pPr>
               <w:ind w:left="360"/>
               <w:rPr>
                 <w:rFonts w:ascii="Arial Narrow" w:hAnsi="Arial Narrow"/>
@@ -1040,7 +755,7 @@
                 <w:sz w:val="21"/>
                 <w:lang w:eastAsia="ja-JP"/>
               </w:rPr>
-              <w:t>{{cust_sat}}</w:t>
+              <w:t>{{#cust_sat}}{{.}}{{/cust_sat}}</w:t>
             </w:r>
           </w:p>
         </w:tc>
@@ -1243,30 +958,6 @@
               <w:rPr>
                 <w:rFonts w:ascii="Arial Narrow" w:hAnsi="Arial Narrow"/>
                 <w:b/>
-                <w:color w:val="0000FF"/>
-                <w:sz w:val="21"/>
-                <w:szCs w:val="21"/>
-              </w:rPr>
-            </w:r>
-          </w:p>
-          <w:p>
-            <w:pPr>
-              <w:pStyle w:val="PlainText"/>
-              <w:numPr>
-                <w:ilvl w:val="3"/>
-                <w:numId w:val="14"/>
-              </w:numPr>
-              <w:ind w:left="420" w:hanging="420"/>
-              <w:rPr>
-                <w:rFonts w:ascii="Arial Narrow" w:hAnsi="Arial Narrow"/>
-                <w:color w:val="0000FF"/>
-                <w:sz w:val="21"/>
-                <w:szCs w:val="21"/>
-              </w:rPr>
-            </w:pPr>
-            <w:r>
-              <w:rPr>
-                <w:rFonts w:ascii="Arial Narrow" w:hAnsi="Arial Narrow"/>
                 <w:color w:val="0000FF"/>
                 <w:sz w:val="21"/>
                 <w:szCs w:val="21"/>

</xml_diff>